<commit_message>
lab2 report edit and lab3 coding
</commit_message>
<xml_diff>
--- a/Lab2/KQC7016 WorldEnergy Exploratory Data Analysis report.docx
+++ b/Lab2/KQC7016 WorldEnergy Exploratory Data Analysis report.docx
@@ -12,6 +12,49 @@
           <w:szCs w:val="28"/>
         </w:rPr>
       </w:pPr>
+      <w:r>
+        <w:rPr>
+          <w:rFonts w:ascii="Arial" w:hAnsi="Arial" w:cs="Arial"/>
+          <w:b/>
+          <w:bCs/>
+          <w:noProof/>
+        </w:rPr>
+        <w:drawing>
+          <wp:inline distT="0" distB="0" distL="0" distR="0" wp14:anchorId="1EC0A591" wp14:editId="5F9C6991">
+            <wp:extent cx="3030691" cy="3209925"/>
+            <wp:effectExtent l="0" t="0" r="0" b="0"/>
+            <wp:docPr id="795127713" name="Picture 1" descr="A blue shield with lions and text&#10;&#10;Description automatically generated"/>
+            <wp:cNvGraphicFramePr>
+              <a:graphicFrameLocks xmlns:a="http://schemas.openxmlformats.org/drawingml/2006/main" noChangeAspect="1"/>
+            </wp:cNvGraphicFramePr>
+            <a:graphic xmlns:a="http://schemas.openxmlformats.org/drawingml/2006/main">
+              <a:graphicData uri="http://schemas.openxmlformats.org/drawingml/2006/picture">
+                <pic:pic xmlns:pic="http://schemas.openxmlformats.org/drawingml/2006/picture">
+                  <pic:nvPicPr>
+                    <pic:cNvPr id="795127713" name="Picture 1" descr="A blue shield with lions and text&#10;&#10;Description automatically generated"/>
+                    <pic:cNvPicPr/>
+                  </pic:nvPicPr>
+                  <pic:blipFill>
+                    <a:blip r:embed="rId8"/>
+                    <a:stretch>
+                      <a:fillRect/>
+                    </a:stretch>
+                  </pic:blipFill>
+                  <pic:spPr>
+                    <a:xfrm>
+                      <a:off x="0" y="0"/>
+                      <a:ext cx="3058154" cy="3239012"/>
+                    </a:xfrm>
+                    <a:prstGeom prst="rect">
+                      <a:avLst/>
+                    </a:prstGeom>
+                  </pic:spPr>
+                </pic:pic>
+              </a:graphicData>
+            </a:graphic>
+          </wp:inline>
+        </w:drawing>
+      </w:r>
     </w:p>
     <w:p>
       <w:pPr>
@@ -20,59 +63,17 @@
           <w:rFonts w:ascii="Times New Roman" w:hAnsi="Times New Roman" w:cs="Times New Roman"/>
           <w:b/>
           <w:bCs/>
-          <w:sz w:val="52"/>
-          <w:szCs w:val="52"/>
-        </w:rPr>
-      </w:pPr>
-      <w:r>
-        <w:rPr>
-          <w:rFonts w:ascii="Times New Roman" w:hAnsi="Times New Roman" w:cs="Times New Roman"/>
-          <w:b/>
-          <w:bCs/>
-          <w:sz w:val="52"/>
-          <w:szCs w:val="52"/>
-        </w:rPr>
-        <w:t>World</w:t>
-      </w:r>
-      <w:r>
-        <w:rPr>
-          <w:rFonts w:ascii="Times New Roman" w:hAnsi="Times New Roman" w:cs="Times New Roman" w:hint="eastAsia"/>
-          <w:b/>
-          <w:bCs/>
-          <w:sz w:val="52"/>
-          <w:szCs w:val="52"/>
-        </w:rPr>
-        <w:t xml:space="preserve"> </w:t>
-      </w:r>
-      <w:r>
-        <w:rPr>
-          <w:rFonts w:ascii="Times New Roman" w:hAnsi="Times New Roman" w:cs="Times New Roman"/>
-          <w:b/>
-          <w:bCs/>
-          <w:sz w:val="52"/>
-          <w:szCs w:val="52"/>
-        </w:rPr>
-        <w:t>Energy Exploratory Data Analysis</w:t>
-      </w:r>
-    </w:p>
-    <w:p>
-      <w:pPr>
-        <w:jc w:val="center"/>
-        <w:rPr>
-          <w:rFonts w:ascii="Times New Roman" w:hAnsi="Times New Roman" w:cs="Times New Roman"/>
-          <w:b/>
-          <w:bCs/>
-          <w:sz w:val="36"/>
-          <w:szCs w:val="36"/>
-        </w:rPr>
-      </w:pPr>
-      <w:r>
-        <w:rPr>
-          <w:rFonts w:ascii="Times New Roman" w:hAnsi="Times New Roman" w:cs="Times New Roman"/>
-          <w:b/>
-          <w:bCs/>
-          <w:sz w:val="36"/>
-          <w:szCs w:val="36"/>
+          <w:sz w:val="44"/>
+          <w:szCs w:val="44"/>
+        </w:rPr>
+      </w:pPr>
+      <w:r>
+        <w:rPr>
+          <w:rFonts w:ascii="Times New Roman" w:hAnsi="Times New Roman" w:cs="Times New Roman"/>
+          <w:b/>
+          <w:bCs/>
+          <w:sz w:val="44"/>
+          <w:szCs w:val="44"/>
         </w:rPr>
         <w:t>KQC7016 DATA ANALYTICS</w:t>
       </w:r>
@@ -130,57 +131,6 @@
     <w:p>
       <w:pPr>
         <w:rPr>
-          <w:b/>
-          <w:bCs/>
-          <w:sz w:val="28"/>
-          <w:szCs w:val="28"/>
-        </w:rPr>
-      </w:pPr>
-    </w:p>
-    <w:p>
-      <w:pPr>
-        <w:rPr>
-          <w:b/>
-          <w:bCs/>
-          <w:sz w:val="28"/>
-          <w:szCs w:val="28"/>
-        </w:rPr>
-      </w:pPr>
-    </w:p>
-    <w:p>
-      <w:pPr>
-        <w:rPr>
-          <w:b/>
-          <w:bCs/>
-          <w:sz w:val="28"/>
-          <w:szCs w:val="28"/>
-        </w:rPr>
-      </w:pPr>
-    </w:p>
-    <w:p>
-      <w:pPr>
-        <w:rPr>
-          <w:b/>
-          <w:bCs/>
-          <w:sz w:val="28"/>
-          <w:szCs w:val="28"/>
-        </w:rPr>
-      </w:pPr>
-    </w:p>
-    <w:p>
-      <w:pPr>
-        <w:rPr>
-          <w:b/>
-          <w:bCs/>
-          <w:sz w:val="28"/>
-          <w:szCs w:val="28"/>
-        </w:rPr>
-      </w:pPr>
-    </w:p>
-    <w:p>
-      <w:pPr>
-        <w:rPr>
-          <w:rFonts w:hint="eastAsia"/>
           <w:b/>
           <w:bCs/>
           <w:sz w:val="28"/>
@@ -398,6 +348,7 @@
           <w:sz w:val="32"/>
           <w:szCs w:val="32"/>
         </w:rPr>
+        <w:lastRenderedPageBreak/>
         <w:t>1. Report Overview</w:t>
       </w:r>
     </w:p>
@@ -498,7 +449,7 @@
                     <pic:cNvPicPr/>
                   </pic:nvPicPr>
                   <pic:blipFill>
-                    <a:blip r:embed="rId8"/>
+                    <a:blip r:embed="rId9"/>
                     <a:stretch>
                       <a:fillRect/>
                     </a:stretch>
@@ -533,15 +484,22 @@
           <w:bCs/>
           <w:sz w:val="24"/>
         </w:rPr>
+        <w:t>Technical Application</w:t>
+      </w:r>
+      <w:r>
+        <w:rPr>
+          <w:rFonts w:ascii="Times New Roman" w:hAnsi="Times New Roman" w:cs="Times New Roman"/>
+          <w:sz w:val="24"/>
+        </w:rPr>
+        <w:t xml:space="preserve">: This section adopts time-based pattern recognition. Line plots </w:t>
+      </w:r>
+      <w:r>
+        <w:rPr>
+          <w:rFonts w:ascii="Times New Roman" w:hAnsi="Times New Roman" w:cs="Times New Roman"/>
+          <w:sz w:val="24"/>
+        </w:rPr>
         <w:lastRenderedPageBreak/>
-        <w:t>Technical Application</w:t>
-      </w:r>
-      <w:r>
-        <w:rPr>
-          <w:rFonts w:ascii="Times New Roman" w:hAnsi="Times New Roman" w:cs="Times New Roman"/>
-          <w:sz w:val="24"/>
-        </w:rPr>
-        <w:t>: This section adopts time-based pattern recognition. Line plots generated via Python are used to observe the dynamic changes of two key variables, "fossil energy share" and "renewable energy share", over time.</w:t>
+        <w:t>generated via Python are used to observe the dynamic changes of two key variables, "fossil energy share" and "renewable energy share", over time.</w:t>
       </w:r>
     </w:p>
     <w:p>
@@ -696,7 +654,7 @@
                     <pic:cNvPicPr/>
                   </pic:nvPicPr>
                   <pic:blipFill>
-                    <a:blip r:embed="rId9"/>
+                    <a:blip r:embed="rId10"/>
                     <a:stretch>
                       <a:fillRect/>
                     </a:stretch>
@@ -787,23 +745,7 @@
           <w:rFonts w:ascii="Times New Roman" w:hAnsi="Times New Roman" w:cs="Times New Roman"/>
           <w:sz w:val="24"/>
         </w:rPr>
-        <w:t>: The chart displays a strong positive correlation between economic level and energy demand on a logarithmic scale. Observing the chart, most data points extend diagonally from the bottom-left (low income, low energy consumption) to the top-right (</w:t>
-      </w:r>
-      <w:proofErr w:type="gramStart"/>
-      <w:r>
-        <w:rPr>
-          <w:rFonts w:ascii="Times New Roman" w:hAnsi="Times New Roman" w:cs="Times New Roman"/>
-          <w:sz w:val="24"/>
-        </w:rPr>
-        <w:t>high income, high energy</w:t>
-      </w:r>
-      <w:proofErr w:type="gramEnd"/>
-      <w:r>
-        <w:rPr>
-          <w:rFonts w:ascii="Times New Roman" w:hAnsi="Times New Roman" w:cs="Times New Roman"/>
-          <w:sz w:val="24"/>
-        </w:rPr>
-        <w:t xml:space="preserve"> consumption), which strongly proves the strong binding relationship between economic output and energy input. Although the chart covers countries with vastly different population sizes (represented by the size of dots), almost all points follow this upward-sloping path regardless of the country's scale. This consistency across different social backgrounds enhances the reliability of the conclusion of "positive correlation".</w:t>
+        <w:t>: The chart displays a strong positive correlation between economic level and energy demand on a logarithmic scale. Observing the chart, most data points extend diagonally from the bottom-left (low income, low energy consumption) to the top-right (high income, high energy consumption), which strongly proves the strong binding relationship between economic output and energy input. Although the chart covers countries with vastly different population sizes (represented by the size of dots), almost all points follow this upward-sloping path regardless of the country's scale. This consistency across different social backgrounds enhances the reliability of the conclusion of "positive correlation".</w:t>
       </w:r>
     </w:p>
     <w:p>
@@ -978,7 +920,7 @@
                     <pic:cNvPicPr/>
                   </pic:nvPicPr>
                   <pic:blipFill>
-                    <a:blip r:embed="rId10"/>
+                    <a:blip r:embed="rId11"/>
                     <a:stretch>
                       <a:fillRect/>
                     </a:stretch>
@@ -1478,10 +1420,68 @@
     <w:p>
       <w:pPr>
         <w:rPr>
+          <w:rFonts w:ascii="Times New Roman" w:hAnsi="Times New Roman" w:cs="Times New Roman"/>
+          <w:b/>
+          <w:bCs/>
+          <w:sz w:val="32"/>
+          <w:szCs w:val="32"/>
+        </w:rPr>
+      </w:pPr>
+      <w:r>
+        <w:rPr>
           <w:rFonts w:ascii="Times New Roman" w:hAnsi="Times New Roman" w:cs="Times New Roman" w:hint="eastAsia"/>
-          <w:sz w:val="24"/>
-        </w:rPr>
-      </w:pPr>
+          <w:b/>
+          <w:bCs/>
+          <w:sz w:val="32"/>
+          <w:szCs w:val="32"/>
+        </w:rPr>
+        <w:t>4</w:t>
+      </w:r>
+      <w:r>
+        <w:rPr>
+          <w:rFonts w:ascii="Times New Roman" w:hAnsi="Times New Roman" w:cs="Times New Roman"/>
+          <w:b/>
+          <w:bCs/>
+          <w:sz w:val="32"/>
+          <w:szCs w:val="32"/>
+        </w:rPr>
+        <w:t xml:space="preserve">. </w:t>
+      </w:r>
+      <w:r>
+        <w:rPr>
+          <w:rFonts w:ascii="Times New Roman" w:hAnsi="Times New Roman" w:cs="Times New Roman" w:hint="eastAsia"/>
+          <w:b/>
+          <w:bCs/>
+          <w:sz w:val="32"/>
+          <w:szCs w:val="32"/>
+        </w:rPr>
+        <w:t>C</w:t>
+      </w:r>
+      <w:r>
+        <w:rPr>
+          <w:rFonts w:ascii="Times New Roman" w:hAnsi="Times New Roman" w:cs="Times New Roman"/>
+          <w:b/>
+          <w:bCs/>
+          <w:sz w:val="32"/>
+          <w:szCs w:val="32"/>
+        </w:rPr>
+        <w:t>onclusion</w:t>
+      </w:r>
+    </w:p>
+    <w:p>
+      <w:pPr>
+        <w:rPr>
+          <w:rFonts w:ascii="Times New Roman" w:hAnsi="Times New Roman" w:cs="Times New Roman"/>
+          <w:sz w:val="24"/>
+        </w:rPr>
+      </w:pPr>
+      <w:r>
+        <w:rPr>
+          <w:rFonts w:ascii="Times New Roman" w:hAnsi="Times New Roman" w:cs="Times New Roman"/>
+          <w:sz w:val="24"/>
+        </w:rPr>
+        <w:t>Through Exploratory Data Analysis (EDA), this report clearly shows that the world power structure is in deep transition from traditional fossil fuel dominance to driven by renewable energy. This report not only quantitatively analyzes the energy evolution patterns from a technical perspective by employing diverse analysis methods like descriptive analysis, diagnostic analysis, and predictive analysis with the assistance of tools such as NumPy and Pandas, but also sets up a data-driven decision-making basis at the business level to offer data support for think tank policy consulting and the overseas expansion of new energy equipment. In the future global energy market, companies and leaders who can understand the differences in regional energy structures and keenly capture the "inflection points" of the transition will be able to stand out in the low-carbon transformation era and seize the initiative in competition.</w:t>
+      </w:r>
     </w:p>
     <w:sectPr>
       <w:pgSz w:w="11906" w:h="16838"/>

</xml_diff>